<commit_message>
tomme klasser som skal brukes til prosjektet
</commit_message>
<xml_diff>
--- a/Arbeidskontrakt IDATT2003 gruppe-09.docx
+++ b/Arbeidskontrakt IDATT2003 gruppe-09.docx
@@ -670,7 +670,7 @@
     </w:p>
     <w:p>
       <w:pPr>
-        <w:pStyle w:val="Listeavsnitt"/>
+        <w:pStyle w:val="ListParagraph"/>
         <w:numPr>
           <w:ilvl w:val="0"/>
           <w:numId w:val="3"/>
@@ -682,7 +682,7 @@
     </w:p>
     <w:p>
       <w:pPr>
-        <w:pStyle w:val="Listeavsnitt"/>
+        <w:pStyle w:val="ListParagraph"/>
         <w:ind w:left="1416"/>
         <w:rPr>
           <w:lang w:val="nb-NO"/>
@@ -703,7 +703,7 @@
     </w:p>
     <w:p>
       <w:pPr>
-        <w:pStyle w:val="Listeavsnitt"/>
+        <w:pStyle w:val="ListParagraph"/>
         <w:numPr>
           <w:ilvl w:val="0"/>
           <w:numId w:val="3"/>
@@ -715,7 +715,7 @@
     </w:p>
     <w:p>
       <w:pPr>
-        <w:pStyle w:val="Listeavsnitt"/>
+        <w:pStyle w:val="ListParagraph"/>
         <w:ind w:left="1416"/>
         <w:rPr>
           <w:lang w:val="nb-NO"/>
@@ -736,7 +736,7 @@
     </w:p>
     <w:p>
       <w:pPr>
-        <w:pStyle w:val="Listeavsnitt"/>
+        <w:pStyle w:val="ListParagraph"/>
         <w:numPr>
           <w:ilvl w:val="0"/>
           <w:numId w:val="3"/>
@@ -748,7 +748,7 @@
     </w:p>
     <w:p>
       <w:pPr>
-        <w:pStyle w:val="Listeavsnitt"/>
+        <w:pStyle w:val="ListParagraph"/>
         <w:ind w:left="1416"/>
         <w:rPr>
           <w:lang w:val="nb-NO"/>
@@ -944,10 +944,10 @@
         <mc:AlternateContent>
           <mc:Choice Requires="wpi">
             <w:drawing>
-              <wp:inline distT="0" distB="0" distL="0" distR="0" wp14:anchorId="35532DAC" wp14:editId="254242A3">
+              <wp:inline distT="0" distB="0" distL="0" distR="0" wp14:anchorId="2D1CE088" wp14:editId="13785E98">
                 <wp:extent cx="1937385" cy="614680"/>
                 <wp:effectExtent l="57150" t="57150" r="43815" b="71120"/>
-                <wp:docPr id="20535008" name="Håndskrift 1"/>
+                <wp:docPr id="1000935326" name="Håndskrift 1"/>
                 <wp:cNvGraphicFramePr/>
                 <a:graphic xmlns:a="http://schemas.openxmlformats.org/drawingml/2006/main">
                   <a:graphicData uri="http://schemas.microsoft.com/office/word/2010/wordprocessingInk">
@@ -975,15 +975,21 @@
       </w:r>
       <w:r>
         <w:rPr>
+          <w:lang w:val="nn-NO"/>
+        </w:rPr>
+        <w:t xml:space="preserve">              </w:t>
+      </w:r>
+      <w:r>
+        <w:rPr>
           <w:noProof/>
         </w:rPr>
         <mc:AlternateContent>
           <mc:Choice Requires="wpi">
             <w:drawing>
-              <wp:inline distT="0" distB="0" distL="0" distR="0" wp14:anchorId="6A748085" wp14:editId="0DA7D31C">
+              <wp:inline distT="0" distB="0" distL="0" distR="0" wp14:anchorId="7A1D980D" wp14:editId="05B9E313">
                 <wp:extent cx="2533883" cy="657665"/>
                 <wp:effectExtent l="57150" t="57150" r="0" b="66675"/>
-                <wp:docPr id="1247925579" name="Håndskrift 1"/>
+                <wp:docPr id="1203865792" name="Håndskrift 1"/>
                 <wp:cNvGraphicFramePr/>
                 <a:graphic xmlns:a="http://schemas.openxmlformats.org/drawingml/2006/main">
                   <a:graphicData uri="http://schemas.microsoft.com/office/word/2010/wordprocessingInk">
@@ -1798,11 +1804,11 @@
       <w14:ligatures w14:val="none"/>
     </w:rPr>
   </w:style>
-  <w:style w:type="paragraph" w:styleId="Overskrift1">
+  <w:style w:type="paragraph" w:styleId="Heading1">
     <w:name w:val="heading 1"/>
     <w:basedOn w:val="Normal"/>
     <w:next w:val="Normal"/>
-    <w:link w:val="Overskrift1Tegn"/>
+    <w:link w:val="Heading1Char"/>
     <w:uiPriority w:val="9"/>
     <w:qFormat/>
     <w:rsid w:val="001A442B"/>
@@ -1819,11 +1825,11 @@
       <w:szCs w:val="40"/>
     </w:rPr>
   </w:style>
-  <w:style w:type="paragraph" w:styleId="Overskrift2">
+  <w:style w:type="paragraph" w:styleId="Heading2">
     <w:name w:val="heading 2"/>
     <w:basedOn w:val="Normal"/>
     <w:next w:val="Normal"/>
-    <w:link w:val="Overskrift2Tegn"/>
+    <w:link w:val="Heading2Char"/>
     <w:uiPriority w:val="9"/>
     <w:semiHidden/>
     <w:unhideWhenUsed/>
@@ -1842,11 +1848,11 @@
       <w:szCs w:val="32"/>
     </w:rPr>
   </w:style>
-  <w:style w:type="paragraph" w:styleId="Overskrift3">
+  <w:style w:type="paragraph" w:styleId="Heading3">
     <w:name w:val="heading 3"/>
     <w:basedOn w:val="Normal"/>
     <w:next w:val="Normal"/>
-    <w:link w:val="Overskrift3Tegn"/>
+    <w:link w:val="Heading3Char"/>
     <w:uiPriority w:val="9"/>
     <w:semiHidden/>
     <w:unhideWhenUsed/>
@@ -1865,11 +1871,11 @@
       <w:szCs w:val="28"/>
     </w:rPr>
   </w:style>
-  <w:style w:type="paragraph" w:styleId="Overskrift4">
+  <w:style w:type="paragraph" w:styleId="Heading4">
     <w:name w:val="heading 4"/>
     <w:basedOn w:val="Normal"/>
     <w:next w:val="Normal"/>
-    <w:link w:val="Overskrift4Tegn"/>
+    <w:link w:val="Heading4Char"/>
     <w:uiPriority w:val="9"/>
     <w:semiHidden/>
     <w:unhideWhenUsed/>
@@ -1888,11 +1894,11 @@
       <w:color w:val="0F4761" w:themeColor="accent1" w:themeShade="BF"/>
     </w:rPr>
   </w:style>
-  <w:style w:type="paragraph" w:styleId="Overskrift5">
+  <w:style w:type="paragraph" w:styleId="Heading5">
     <w:name w:val="heading 5"/>
     <w:basedOn w:val="Normal"/>
     <w:next w:val="Normal"/>
-    <w:link w:val="Overskrift5Tegn"/>
+    <w:link w:val="Heading5Char"/>
     <w:uiPriority w:val="9"/>
     <w:semiHidden/>
     <w:unhideWhenUsed/>
@@ -1909,11 +1915,11 @@
       <w:color w:val="0F4761" w:themeColor="accent1" w:themeShade="BF"/>
     </w:rPr>
   </w:style>
-  <w:style w:type="paragraph" w:styleId="Overskrift6">
+  <w:style w:type="paragraph" w:styleId="Heading6">
     <w:name w:val="heading 6"/>
     <w:basedOn w:val="Normal"/>
     <w:next w:val="Normal"/>
-    <w:link w:val="Overskrift6Tegn"/>
+    <w:link w:val="Heading6Char"/>
     <w:uiPriority w:val="9"/>
     <w:semiHidden/>
     <w:unhideWhenUsed/>
@@ -1932,11 +1938,11 @@
       <w:color w:val="595959" w:themeColor="text1" w:themeTint="A6"/>
     </w:rPr>
   </w:style>
-  <w:style w:type="paragraph" w:styleId="Overskrift7">
+  <w:style w:type="paragraph" w:styleId="Heading7">
     <w:name w:val="heading 7"/>
     <w:basedOn w:val="Normal"/>
     <w:next w:val="Normal"/>
-    <w:link w:val="Overskrift7Tegn"/>
+    <w:link w:val="Heading7Char"/>
     <w:uiPriority w:val="9"/>
     <w:semiHidden/>
     <w:unhideWhenUsed/>
@@ -1953,11 +1959,11 @@
       <w:color w:val="595959" w:themeColor="text1" w:themeTint="A6"/>
     </w:rPr>
   </w:style>
-  <w:style w:type="paragraph" w:styleId="Overskrift8">
+  <w:style w:type="paragraph" w:styleId="Heading8">
     <w:name w:val="heading 8"/>
     <w:basedOn w:val="Normal"/>
     <w:next w:val="Normal"/>
-    <w:link w:val="Overskrift8Tegn"/>
+    <w:link w:val="Heading8Char"/>
     <w:uiPriority w:val="9"/>
     <w:semiHidden/>
     <w:unhideWhenUsed/>
@@ -1976,11 +1982,11 @@
       <w:color w:val="272727" w:themeColor="text1" w:themeTint="D8"/>
     </w:rPr>
   </w:style>
-  <w:style w:type="paragraph" w:styleId="Overskrift9">
+  <w:style w:type="paragraph" w:styleId="Heading9">
     <w:name w:val="heading 9"/>
     <w:basedOn w:val="Normal"/>
     <w:next w:val="Normal"/>
-    <w:link w:val="Overskrift9Tegn"/>
+    <w:link w:val="Heading9Char"/>
     <w:uiPriority w:val="9"/>
     <w:semiHidden/>
     <w:unhideWhenUsed/>
@@ -1997,13 +2003,13 @@
       <w:color w:val="272727" w:themeColor="text1" w:themeTint="D8"/>
     </w:rPr>
   </w:style>
-  <w:style w:type="character" w:default="1" w:styleId="Standardskriftforavsnitt">
+  <w:style w:type="character" w:default="1" w:styleId="DefaultParagraphFont">
     <w:name w:val="Default Paragraph Font"/>
     <w:uiPriority w:val="1"/>
     <w:semiHidden/>
     <w:unhideWhenUsed/>
   </w:style>
-  <w:style w:type="table" w:default="1" w:styleId="Vanligtabell">
+  <w:style w:type="table" w:default="1" w:styleId="TableNormal">
     <w:name w:val="Normal Table"/>
     <w:uiPriority w:val="99"/>
     <w:semiHidden/>
@@ -2018,16 +2024,16 @@
       </w:tblCellMar>
     </w:tblPr>
   </w:style>
-  <w:style w:type="numbering" w:default="1" w:styleId="Ingenliste">
+  <w:style w:type="numbering" w:default="1" w:styleId="NoList">
     <w:name w:val="No List"/>
     <w:uiPriority w:val="99"/>
     <w:semiHidden/>
     <w:unhideWhenUsed/>
   </w:style>
-  <w:style w:type="character" w:customStyle="1" w:styleId="Overskrift1Tegn">
-    <w:name w:val="Overskrift 1 Tegn"/>
-    <w:basedOn w:val="Standardskriftforavsnitt"/>
-    <w:link w:val="Overskrift1"/>
+  <w:style w:type="character" w:customStyle="1" w:styleId="Heading1Char">
+    <w:name w:val="Heading 1 Char"/>
+    <w:basedOn w:val="DefaultParagraphFont"/>
+    <w:link w:val="Heading1"/>
     <w:uiPriority w:val="9"/>
     <w:rsid w:val="001A442B"/>
     <w:rPr>
@@ -2037,10 +2043,10 @@
       <w:szCs w:val="40"/>
     </w:rPr>
   </w:style>
-  <w:style w:type="character" w:customStyle="1" w:styleId="Overskrift2Tegn">
-    <w:name w:val="Overskrift 2 Tegn"/>
-    <w:basedOn w:val="Standardskriftforavsnitt"/>
-    <w:link w:val="Overskrift2"/>
+  <w:style w:type="character" w:customStyle="1" w:styleId="Heading2Char">
+    <w:name w:val="Heading 2 Char"/>
+    <w:basedOn w:val="DefaultParagraphFont"/>
+    <w:link w:val="Heading2"/>
     <w:uiPriority w:val="9"/>
     <w:semiHidden/>
     <w:rsid w:val="001A442B"/>
@@ -2051,10 +2057,10 @@
       <w:szCs w:val="32"/>
     </w:rPr>
   </w:style>
-  <w:style w:type="character" w:customStyle="1" w:styleId="Overskrift3Tegn">
-    <w:name w:val="Overskrift 3 Tegn"/>
-    <w:basedOn w:val="Standardskriftforavsnitt"/>
-    <w:link w:val="Overskrift3"/>
+  <w:style w:type="character" w:customStyle="1" w:styleId="Heading3Char">
+    <w:name w:val="Heading 3 Char"/>
+    <w:basedOn w:val="DefaultParagraphFont"/>
+    <w:link w:val="Heading3"/>
     <w:uiPriority w:val="9"/>
     <w:semiHidden/>
     <w:rsid w:val="001A442B"/>
@@ -2065,10 +2071,10 @@
       <w:szCs w:val="28"/>
     </w:rPr>
   </w:style>
-  <w:style w:type="character" w:customStyle="1" w:styleId="Overskrift4Tegn">
-    <w:name w:val="Overskrift 4 Tegn"/>
-    <w:basedOn w:val="Standardskriftforavsnitt"/>
-    <w:link w:val="Overskrift4"/>
+  <w:style w:type="character" w:customStyle="1" w:styleId="Heading4Char">
+    <w:name w:val="Heading 4 Char"/>
+    <w:basedOn w:val="DefaultParagraphFont"/>
+    <w:link w:val="Heading4"/>
     <w:uiPriority w:val="9"/>
     <w:semiHidden/>
     <w:rsid w:val="001A442B"/>
@@ -2079,10 +2085,10 @@
       <w:color w:val="0F4761" w:themeColor="accent1" w:themeShade="BF"/>
     </w:rPr>
   </w:style>
-  <w:style w:type="character" w:customStyle="1" w:styleId="Overskrift5Tegn">
-    <w:name w:val="Overskrift 5 Tegn"/>
-    <w:basedOn w:val="Standardskriftforavsnitt"/>
-    <w:link w:val="Overskrift5"/>
+  <w:style w:type="character" w:customStyle="1" w:styleId="Heading5Char">
+    <w:name w:val="Heading 5 Char"/>
+    <w:basedOn w:val="DefaultParagraphFont"/>
+    <w:link w:val="Heading5"/>
     <w:uiPriority w:val="9"/>
     <w:semiHidden/>
     <w:rsid w:val="001A442B"/>
@@ -2091,10 +2097,10 @@
       <w:color w:val="0F4761" w:themeColor="accent1" w:themeShade="BF"/>
     </w:rPr>
   </w:style>
-  <w:style w:type="character" w:customStyle="1" w:styleId="Overskrift6Tegn">
-    <w:name w:val="Overskrift 6 Tegn"/>
-    <w:basedOn w:val="Standardskriftforavsnitt"/>
-    <w:link w:val="Overskrift6"/>
+  <w:style w:type="character" w:customStyle="1" w:styleId="Heading6Char">
+    <w:name w:val="Heading 6 Char"/>
+    <w:basedOn w:val="DefaultParagraphFont"/>
+    <w:link w:val="Heading6"/>
     <w:uiPriority w:val="9"/>
     <w:semiHidden/>
     <w:rsid w:val="001A442B"/>
@@ -2105,10 +2111,10 @@
       <w:color w:val="595959" w:themeColor="text1" w:themeTint="A6"/>
     </w:rPr>
   </w:style>
-  <w:style w:type="character" w:customStyle="1" w:styleId="Overskrift7Tegn">
-    <w:name w:val="Overskrift 7 Tegn"/>
-    <w:basedOn w:val="Standardskriftforavsnitt"/>
-    <w:link w:val="Overskrift7"/>
+  <w:style w:type="character" w:customStyle="1" w:styleId="Heading7Char">
+    <w:name w:val="Heading 7 Char"/>
+    <w:basedOn w:val="DefaultParagraphFont"/>
+    <w:link w:val="Heading7"/>
     <w:uiPriority w:val="9"/>
     <w:semiHidden/>
     <w:rsid w:val="001A442B"/>
@@ -2117,10 +2123,10 @@
       <w:color w:val="595959" w:themeColor="text1" w:themeTint="A6"/>
     </w:rPr>
   </w:style>
-  <w:style w:type="character" w:customStyle="1" w:styleId="Overskrift8Tegn">
-    <w:name w:val="Overskrift 8 Tegn"/>
-    <w:basedOn w:val="Standardskriftforavsnitt"/>
-    <w:link w:val="Overskrift8"/>
+  <w:style w:type="character" w:customStyle="1" w:styleId="Heading8Char">
+    <w:name w:val="Heading 8 Char"/>
+    <w:basedOn w:val="DefaultParagraphFont"/>
+    <w:link w:val="Heading8"/>
     <w:uiPriority w:val="9"/>
     <w:semiHidden/>
     <w:rsid w:val="001A442B"/>
@@ -2131,10 +2137,10 @@
       <w:color w:val="272727" w:themeColor="text1" w:themeTint="D8"/>
     </w:rPr>
   </w:style>
-  <w:style w:type="character" w:customStyle="1" w:styleId="Overskrift9Tegn">
-    <w:name w:val="Overskrift 9 Tegn"/>
-    <w:basedOn w:val="Standardskriftforavsnitt"/>
-    <w:link w:val="Overskrift9"/>
+  <w:style w:type="character" w:customStyle="1" w:styleId="Heading9Char">
+    <w:name w:val="Heading 9 Char"/>
+    <w:basedOn w:val="DefaultParagraphFont"/>
+    <w:link w:val="Heading9"/>
     <w:uiPriority w:val="9"/>
     <w:semiHidden/>
     <w:rsid w:val="001A442B"/>
@@ -2143,11 +2149,11 @@
       <w:color w:val="272727" w:themeColor="text1" w:themeTint="D8"/>
     </w:rPr>
   </w:style>
-  <w:style w:type="paragraph" w:styleId="Tittel">
+  <w:style w:type="paragraph" w:styleId="Title">
     <w:name w:val="Title"/>
     <w:basedOn w:val="Normal"/>
     <w:next w:val="Normal"/>
-    <w:link w:val="TittelTegn"/>
+    <w:link w:val="TitleChar"/>
     <w:uiPriority w:val="10"/>
     <w:qFormat/>
     <w:rsid w:val="001A442B"/>
@@ -2163,10 +2169,10 @@
       <w:szCs w:val="56"/>
     </w:rPr>
   </w:style>
-  <w:style w:type="character" w:customStyle="1" w:styleId="TittelTegn">
-    <w:name w:val="Tittel Tegn"/>
-    <w:basedOn w:val="Standardskriftforavsnitt"/>
-    <w:link w:val="Tittel"/>
+  <w:style w:type="character" w:customStyle="1" w:styleId="TitleChar">
+    <w:name w:val="Title Char"/>
+    <w:basedOn w:val="DefaultParagraphFont"/>
+    <w:link w:val="Title"/>
     <w:uiPriority w:val="10"/>
     <w:rsid w:val="001A442B"/>
     <w:rPr>
@@ -2177,11 +2183,11 @@
       <w:szCs w:val="56"/>
     </w:rPr>
   </w:style>
-  <w:style w:type="paragraph" w:styleId="Undertittel">
+  <w:style w:type="paragraph" w:styleId="Subtitle">
     <w:name w:val="Subtitle"/>
     <w:basedOn w:val="Normal"/>
     <w:next w:val="Normal"/>
-    <w:link w:val="UndertittelTegn"/>
+    <w:link w:val="SubtitleChar"/>
     <w:uiPriority w:val="11"/>
     <w:qFormat/>
     <w:rsid w:val="001A442B"/>
@@ -2198,10 +2204,10 @@
       <w:szCs w:val="28"/>
     </w:rPr>
   </w:style>
-  <w:style w:type="character" w:customStyle="1" w:styleId="UndertittelTegn">
-    <w:name w:val="Undertittel Tegn"/>
-    <w:basedOn w:val="Standardskriftforavsnitt"/>
-    <w:link w:val="Undertittel"/>
+  <w:style w:type="character" w:customStyle="1" w:styleId="SubtitleChar">
+    <w:name w:val="Subtitle Char"/>
+    <w:basedOn w:val="DefaultParagraphFont"/>
+    <w:link w:val="Subtitle"/>
     <w:uiPriority w:val="11"/>
     <w:rsid w:val="001A442B"/>
     <w:rPr>
@@ -2212,11 +2218,11 @@
       <w:szCs w:val="28"/>
     </w:rPr>
   </w:style>
-  <w:style w:type="paragraph" w:styleId="Sitat">
+  <w:style w:type="paragraph" w:styleId="Quote">
     <w:name w:val="Quote"/>
     <w:basedOn w:val="Normal"/>
     <w:next w:val="Normal"/>
-    <w:link w:val="SitatTegn"/>
+    <w:link w:val="QuoteChar"/>
     <w:uiPriority w:val="29"/>
     <w:qFormat/>
     <w:rsid w:val="001A442B"/>
@@ -2230,10 +2236,10 @@
       <w:color w:val="404040" w:themeColor="text1" w:themeTint="BF"/>
     </w:rPr>
   </w:style>
-  <w:style w:type="character" w:customStyle="1" w:styleId="SitatTegn">
-    <w:name w:val="Sitat Tegn"/>
-    <w:basedOn w:val="Standardskriftforavsnitt"/>
-    <w:link w:val="Sitat"/>
+  <w:style w:type="character" w:customStyle="1" w:styleId="QuoteChar">
+    <w:name w:val="Quote Char"/>
+    <w:basedOn w:val="DefaultParagraphFont"/>
+    <w:link w:val="Quote"/>
     <w:uiPriority w:val="29"/>
     <w:rsid w:val="001A442B"/>
     <w:rPr>
@@ -2242,7 +2248,7 @@
       <w:color w:val="404040" w:themeColor="text1" w:themeTint="BF"/>
     </w:rPr>
   </w:style>
-  <w:style w:type="paragraph" w:styleId="Listeavsnitt">
+  <w:style w:type="paragraph" w:styleId="ListParagraph">
     <w:name w:val="List Paragraph"/>
     <w:basedOn w:val="Normal"/>
     <w:uiPriority w:val="34"/>
@@ -2253,9 +2259,9 @@
       <w:contextualSpacing/>
     </w:pPr>
   </w:style>
-  <w:style w:type="character" w:styleId="Sterkutheving">
+  <w:style w:type="character" w:styleId="IntenseEmphasis">
     <w:name w:val="Intense Emphasis"/>
-    <w:basedOn w:val="Standardskriftforavsnitt"/>
+    <w:basedOn w:val="DefaultParagraphFont"/>
     <w:uiPriority w:val="21"/>
     <w:qFormat/>
     <w:rsid w:val="001A442B"/>
@@ -2265,11 +2271,11 @@
       <w:color w:val="0F4761" w:themeColor="accent1" w:themeShade="BF"/>
     </w:rPr>
   </w:style>
-  <w:style w:type="paragraph" w:styleId="Sterktsitat">
+  <w:style w:type="paragraph" w:styleId="IntenseQuote">
     <w:name w:val="Intense Quote"/>
     <w:basedOn w:val="Normal"/>
     <w:next w:val="Normal"/>
-    <w:link w:val="SterktsitatTegn"/>
+    <w:link w:val="IntenseQuoteChar"/>
     <w:uiPriority w:val="30"/>
     <w:qFormat/>
     <w:rsid w:val="001A442B"/>
@@ -2288,10 +2294,10 @@
       <w:color w:val="0F4761" w:themeColor="accent1" w:themeShade="BF"/>
     </w:rPr>
   </w:style>
-  <w:style w:type="character" w:customStyle="1" w:styleId="SterktsitatTegn">
-    <w:name w:val="Sterkt sitat Tegn"/>
-    <w:basedOn w:val="Standardskriftforavsnitt"/>
-    <w:link w:val="Sterktsitat"/>
+  <w:style w:type="character" w:customStyle="1" w:styleId="IntenseQuoteChar">
+    <w:name w:val="Intense Quote Char"/>
+    <w:basedOn w:val="DefaultParagraphFont"/>
+    <w:link w:val="IntenseQuote"/>
     <w:uiPriority w:val="30"/>
     <w:rsid w:val="001A442B"/>
     <w:rPr>
@@ -2300,9 +2306,9 @@
       <w:color w:val="0F4761" w:themeColor="accent1" w:themeShade="BF"/>
     </w:rPr>
   </w:style>
-  <w:style w:type="character" w:styleId="Sterkreferanse">
+  <w:style w:type="character" w:styleId="IntenseReference">
     <w:name w:val="Intense Reference"/>
-    <w:basedOn w:val="Standardskriftforavsnitt"/>
+    <w:basedOn w:val="DefaultParagraphFont"/>
     <w:uiPriority w:val="32"/>
     <w:qFormat/>
     <w:rsid w:val="001A442B"/>

</xml_diff>